<commit_message>
R2 responses master: reconcile to final N=52 state (mirror of workflow clone)
Mirrors the workflow-clone reconciliation: HHI-Gini N=44/r=0.58, subsidy 0.58/0.06,
cross-section N=52, Figure 1 "52 tokens", Figure 2b added, Figure 4 N=18, Figure 5 (LOO)
+ Figure 6 (subsidy) split. Reviewer-facing; author reviews before Frontiers resubmission.

Co-Authored-By: Claude Opus 4.8 (1M context) <noreply@anthropic.com>
</commit_message>
<xml_diff>
--- a/b2/paper/responses/2026-05-26_R2_responses_master.docx
+++ b/b2/paper/responses/2026-05-26_R2_responses_master.docx
@@ -26,7 +26,7 @@
         <w:t xml:space="preserve"> </w:t>
       </w:r>
       <w:r>
-        <w:t xml:space="preserve">Governance Concentration Beyond Token Allocation: A 40-Protocol Cross-Sectional Audit of DePIN and DeFi After Protocol-Controlled-Address Exclusion</w:t>
+        <w:t xml:space="preserve">Governance Concentration Beyond Token Allocation: A 52-Protocol Cross-Sectional Audit of DePIN and DeFi After Protocol-Controlled-Address Exclusion</w:t>
       </w:r>
       <w:r>
         <w:t xml:space="preserve"> </w:t>
@@ -1673,7 +1673,7 @@
         <w:pStyle w:val="FirstParagraph"/>
       </w:pPr>
       <w:r>
-        <w:t xml:space="preserve">All three protocols now appear as full Table 4 rows with complete holder-level data; the R2 manuscript reports HHI-Gini correlation at N = 40 with both metrics measured for every protocol (Pearson r = 0.59, p &lt; 0.001; documented in Table 5 and Supplementary File S0).</w:t>
+        <w:t xml:space="preserve">All three protocols now appear as full cross-section rows (Table 3) with complete holder-level data. The final manuscript reports the HHI-Gini correlation on the N = 44 governance-token-measured post-exclusion cohort, the frame for which holder-level Gini is directly comparable (Pearson r = 0.58, p &lt; 0.001; Table 4 and Supplementary File S0); the comparable cohort grew from 40 to 44 as the cross-section expanded to its final 52-protocol frame.</w:t>
       </w:r>
     </w:p>
     <w:p>
@@ -1715,7 +1715,7 @@
         <w:t xml:space="preserve"> </w:t>
       </w:r>
       <w:r>
-        <w:t xml:space="preserve">row: Pearson r = 0.59, p = 0.003, N = 23. Fragile (Livepeer-driven).</w:t>
+        <w:t xml:space="preserve">row: Pearson r = 0.58, p = 0.004, N = 23. Fragile (Livepeer-driven).</w:t>
       </w:r>
     </w:p>
     <w:p>
@@ -1763,7 +1763,7 @@
         <w:t xml:space="preserve"> </w:t>
       </w:r>
       <w:r>
-        <w:t xml:space="preserve">row: Pearson r = 0.07, p = 0.77, N = 22. Null.</w:t>
+        <w:t xml:space="preserve">row: Pearson r = 0.06, p = 0.80, N = 22. Null.</w:t>
       </w:r>
     </w:p>
     <w:p>
@@ -1787,7 +1787,7 @@
         </w:numPr>
       </w:pPr>
       <w:r>
-        <w:t xml:space="preserve">Section 4.6 Robustness paragraph: the headline subsidy correlation is entirely Livepeer-driven (Livepeer subsidy ratio of 88.5x is a 3.5-sigma outlier on the subsidy axis); excluding Livepeer alone reduces the Pearson correlation to a clean null (r = 0.07).</w:t>
+        <w:t xml:space="preserve">Section 4.6 Robustness paragraph: the headline subsidy correlation is entirely Livepeer-driven (Livepeer subsidy ratio of 88.5x is a 3.5-sigma outlier on the subsidy axis); excluding Livepeer alone reduces the Pearson correlation to a clean null (r = 0.06).</w:t>
       </w:r>
     </w:p>
     <w:p>
@@ -1828,7 +1828,7 @@
         <w:t xml:space="preserve">Manuscript changes</w:t>
       </w:r>
       <w:r>
-        <w:t xml:space="preserve">: Table 5 rows updated with current canonical values; Table 4 expanded from 37 to 40 protocols with Hivemapper, io.net, and Aethir as full rows; Section 4.6 subsidy-multivariate paragraph documenting the four specifications; Supplementary File S6 documents the raw-OC methodology refinements per protocol; Supplementary File S8 documents the Token Terminal expansion battery.</w:t>
+        <w:t xml:space="preserve">: Table 5 rows updated with current canonical values; the cross-section (Table 3) reaches its final N = 52 frame, with Hivemapper, io.net, and Aethir among the full rows; Section 4.6 subsidy-multivariate paragraph documenting the four specifications; Supplementary File S6 documents the raw-OC methodology refinements per protocol; Supplementary File S8 documents the Token Terminal expansion battery.</w:t>
       </w:r>
     </w:p>
     <w:p>
@@ -1901,7 +1901,7 @@
         <w:pStyle w:val="BodyText"/>
       </w:pPr>
       <w:r>
-        <w:t xml:space="preserve">The figures in the R2 manuscript are renumbered relative to the R1 manuscript. The R1 figure numbering (3, 4, 5, 6, 7, 8) reflected an earlier iteration that included two theory figures (philosophical-framework architecture; conceptual model) at positions 1 and 2; those theory figures were removed during the R2 empirical reframe and the remaining figures were renumbered 1 through 5. The R2 figures are:</w:t>
+        <w:t xml:space="preserve">The figures in the R2 manuscript are renumbered relative to the R1 manuscript. The R1 figure numbering (3, 4, 5, 6, 7, 8) reflected an earlier iteration that included two theory figures (philosophical-framework architecture; conceptual model) at positions 1 and 2; those theory figures were removed during the R2 empirical reframe and the remaining figures were renumbered 1 through 6 (with a supplementary 2b panel for the three-class sector contrast). The R2 figures are:</w:t>
       </w:r>
     </w:p>
     <w:p>
@@ -1923,7 +1923,7 @@
         <w:t xml:space="preserve"> </w:t>
       </w:r>
       <w:r>
-        <w:t xml:space="preserve">(HHI bar chart across 40 governance tokens; was R1 Figure 3): Holding HHI ranges 0.005 (Hyperliquid) to 0.199 (Livepeer); DePIN cluster in upper half visible.</w:t>
+        <w:t xml:space="preserve">(HHI bar chart across 52 governance tokens; was R1 Figure 3): Holding HHI ranges 0.005 (Hyperliquid) to 0.199 (Livepeer); DePIN cluster in upper half visible.</w:t>
       </w:r>
     </w:p>
     <w:p>
@@ -1961,13 +1961,13 @@
           <w:b/>
           <w:bCs/>
         </w:rPr>
-        <w:t xml:space="preserve">Figure 3</w:t>
-      </w:r>
-      <w:r>
-        <w:t xml:space="preserve"> </w:t>
-      </w:r>
-      <w:r>
-        <w:t xml:space="preserve">(insider allocation scatter; was R1 Figure 5): Pearson r = 0.05, p = 0.76, N = 37 (the headline null). The R1 figure visual reported r = 0.19, p = 0.25 while the caption reported r = 0.18, p = 0.28; the R2 regenerated figure and caption both report the canonical r = 0.05 / p = 0.76 / N = 37 (the R1 manuscript value reflected an earlier pre-canonical-regression dataset state; the headline r dropped to 0.05 after the canonical regression dataset sync established the post-exclusion HHI baseline as the dependent variable and post-PCA-cycle insider allocation as the predictor).</w:t>
+        <w:t xml:space="preserve">Figure 2b</w:t>
+      </w:r>
+      <w:r>
+        <w:t xml:space="preserve"> </w:t>
+      </w:r>
+      <w:r>
+        <w:t xml:space="preserve">(three-class sector boxplot; new in the final version): DePIN versus DeFi versus L1/infrastructure across the N = 44 governance-token frame (Kruskal-Wallis), confirming the sector effect generalizes beyond the balanced 15/15 contrast.</w:t>
       </w:r>
     </w:p>
     <w:p>
@@ -1983,13 +1983,13 @@
           <w:b/>
           <w:bCs/>
         </w:rPr>
-        <w:t xml:space="preserve">Figure 4</w:t>
-      </w:r>
-      <w:r>
-        <w:t xml:space="preserve"> </w:t>
-      </w:r>
-      <w:r>
-        <w:t xml:space="preserve">(delegation-adjusted bar chart; replaces R1 Figure 6): 13-protocol delegation amplification chart with ratios annotated; visual and caption stats reflect the post-multi-source extension N = 13 sample.</w:t>
+        <w:t xml:space="preserve">Figure 3</w:t>
+      </w:r>
+      <w:r>
+        <w:t xml:space="preserve"> </w:t>
+      </w:r>
+      <w:r>
+        <w:t xml:space="preserve">(insider allocation scatter; was R1 Figure 5): Pearson r = 0.05, p = 0.76, N = 37 (the headline null). The R1 figure visual reported r = 0.19, p = 0.25 while the caption reported r = 0.18, p = 0.28; the R2 regenerated figure and caption both report the canonical r = 0.05 / p = 0.76 / N = 37 (the R1 manuscript value reflected an earlier pre-canonical-regression dataset state; the headline r dropped to 0.05 after the canonical regression dataset sync established the post-exclusion HHI baseline as the dependent variable and post-PCA-cycle insider allocation as the predictor).</w:t>
       </w:r>
     </w:p>
     <w:p>
@@ -2005,13 +2005,57 @@
           <w:b/>
           <w:bCs/>
         </w:rPr>
+        <w:t xml:space="preserve">Figure 4</w:t>
+      </w:r>
+      <w:r>
+        <w:t xml:space="preserve"> </w:t>
+      </w:r>
+      <w:r>
+        <w:t xml:space="preserve">(delegation-adjusted bar chart; replaces R1 Figure 6): eighteen-protocol delegation amplification chart (thirteen amplify, five disperse) with ratios annotated; visual and caption stats reflect the N = 18 voting-HHI sample.</w:t>
+      </w:r>
+    </w:p>
+    <w:p>
+      <w:pPr>
+        <w:pStyle w:val="Compact"/>
+        <w:numPr>
+          <w:ilvl w:val="0"/>
+          <w:numId w:val="1004"/>
+        </w:numPr>
+      </w:pPr>
+      <w:r>
+        <w:rPr>
+          <w:b/>
+          <w:bCs/>
+        </w:rPr>
         <w:t xml:space="preserve">Figure 5</w:t>
       </w:r>
       <w:r>
         <w:t xml:space="preserve"> </w:t>
       </w:r>
       <w:r>
-        <w:t xml:space="preserve">(subsidy ratio scatter; was R1 Figure 7): Pearson r = 0.59 inclusive of Livepeer, r = 0.07 excluding Livepeer; N = 23; visual and caption stats match.</w:t>
+        <w:t xml:space="preserve">(leave-one-out sector-contrast forest; new in the final version): all 30 leave-one-out iterations remain significant; Cohen’s d 0.84 to 1.10.</w:t>
+      </w:r>
+    </w:p>
+    <w:p>
+      <w:pPr>
+        <w:pStyle w:val="Compact"/>
+        <w:numPr>
+          <w:ilvl w:val="0"/>
+          <w:numId w:val="1004"/>
+        </w:numPr>
+      </w:pPr>
+      <w:r>
+        <w:rPr>
+          <w:b/>
+          <w:bCs/>
+        </w:rPr>
+        <w:t xml:space="preserve">Figure 6</w:t>
+      </w:r>
+      <w:r>
+        <w:t xml:space="preserve"> </w:t>
+      </w:r>
+      <w:r>
+        <w:t xml:space="preserve">(subsidy ratio scatter; was R1 Figure 7): Pearson r = 0.58 inclusive of Livepeer, r = 0.06 excluding Livepeer; N = 23; visual and caption stats match.</w:t>
       </w:r>
     </w:p>
     <w:p>
@@ -2145,13 +2189,13 @@
           <w:b/>
           <w:bCs/>
         </w:rPr>
-        <w:t xml:space="preserve">Predominant-amplification thesis with four structural exceptions.</w:t>
-      </w:r>
-      <w:r>
-        <w:t xml:space="preserve"> </w:t>
-      </w:r>
-      <w:r>
-        <w:t xml:space="preserve">The Issue 1 resolution plus the post-R1 deep PCA audit (Table 7 sample expanded from N = 8 to N = 10 via GMX and ENS Tally additions), the voting-HHI methodology refresh (Snapshot all-proposals plus Tally top-1000), and the multi-source PCA-symmetric extension (Table 7 N = 10 to N = 13 via JUP, HNT, DRIFT Solana additions) produce the R2 headline finding: delegation amplifies governance concentration in nine of thirteen protocols (range 1.6x DRIFT to 9.9x Compound; mean approximately 4.9x), with ENS at 0.45x (Section 4.5.1), GMX at 0.87x (Section 4.5.1.1), HNT at 0.35x to 0.53x (Section 4.5.4), and JUP at 0.057x (Section 4.5.4) as the four structural exceptions.</w:t>
+        <w:t xml:space="preserve">Predominant-amplification thesis with structural exceptions.</w:t>
+      </w:r>
+      <w:r>
+        <w:t xml:space="preserve"> </w:t>
+      </w:r>
+      <w:r>
+        <w:t xml:space="preserve">The Issue 1 resolution plus the post-R1 deep PCA audit (Table 7 sample expanded from N = 8 to N = 10 via GMX and ENS Tally additions), the voting-HHI methodology refresh (Snapshot all-proposals plus Tally top-1000), and the multi-source PCA-symmetric extension (Table 7 N = 10 to N = 13 via JUP, HNT, DRIFT Solana additions) produced the R2 finding of delegation amplification in nine of thirteen protocols with four structural exceptions. The final-version cycle expanded the voting sample further to eighteen protocols, adding the cross-section additions Gnosis, Synthetix, Bittensor, and Polkadot, and the Livepeer orchestrator-bonded-stake governance measure. The current finding is that thirteen of eighteen protocols amplify (range 1.6x DRIFT to 25.6x Polkadot; mean approximately 6.8x, median 4.4x), with ENS at 0.45x (Section 4.5.1), GMX at 0.87x (Section 4.5.1.1), Helium at 0.35x to 0.53x (Section 4.5.4), Jupiter at 0.057x (Section 4.5.4, the most-extreme dispersion outlier), and Livepeer at 0.27x (Section 4.5, the most pronounced DePIN governance disperser) as the five structural exceptions. The Livepeer measure and the strengthened insider layer are detailed in the final-version enhancement below.</w:t>
       </w:r>
     </w:p>
     <w:p>
@@ -2640,7 +2684,7 @@
         <w:t xml:space="preserve"> </w:t>
       </w:r>
       <w:r>
-        <w:t xml:space="preserve">Four falsifiable predictions operationalized for future panel-data and event-study work: (i) sector persistence (DePIN protocols launching in 2026-2027 will exhibit higher post-distribution holding HHI than DeFi protocols launching in the same period); (ii) delegation amplification universality (any protocol introducing a formal delegate program will produce voting HHI greater than holding HHI within twelve months of launch, with amplification magnitude varying by delegate-program design rather than by sector); (iii) insider-retention persistence (within-protocol panel correlation: protocols whose insider fraction increases will exhibit increased holding HHI); (iv) delegate-program design as moderator (broad-community-delegate distribution design choices yield lower amplification ratios). All four predictions inherit the methodology applied in this paper (PCA-symmetric exclusion via the five-class typology; HHI on post-exclusion top-1,000 holders; Mann-Whitney for two-sample tests; bootstrap 95 percent percentile intervals). Pre-registration commitment: hypothesis specifications, statistical tests, and falsification thresholds will be deposited on the Open Science Framework prior to data collection for any panel-data or event-study extension. Full operationalization detail per prediction in Supplementary File S17.</w:t>
+        <w:t xml:space="preserve">Five falsifiable predictions operationalized for future panel-data and event-study work: (i) sector persistence (DePIN protocols launching in 2026-2027 will exhibit higher post-distribution holding HHI than DeFi protocols launching in the same period); (ii) delegation amplification universality (any protocol introducing a formal delegate program will produce voting HHI greater than holding HHI within twelve months of launch, with amplification magnitude varying by delegate-program design rather than by sector); (iii) insider-retention persistence (within-protocol panel correlation: protocols whose insider fraction increases will exhibit increased holding HHI); (iv) delegate-program design as moderator (broad-community-delegate distribution design choices yield lower amplification ratios); (v) chain-architecture as trajectory moderator (an age-balanced extended cohort matching Solana and EVM DeFi protocols on distribution-phase maturity discriminates whether chain ecosystem moderates the post-distribution deconcentration trajectory independent of maturity). All five predictions inherit the methodology applied in this paper (PCA-symmetric exclusion via the five-class typology; HHI on post-exclusion top-1,000 holders; Mann-Whitney for two-sample tests; bootstrap 95 percent percentile intervals). Pre-registration commitment: hypothesis specifications, statistical tests, and falsification thresholds will be deposited on the Open Science Framework prior to data collection for any panel-data or event-study extension. Full operationalization detail per prediction in Supplementary File S17.</w:t>
       </w:r>
     </w:p>
     <w:p>
@@ -2676,7 +2720,79 @@
         <w:t xml:space="preserve"> </w:t>
       </w:r>
       <w:r>
-        <w:t xml:space="preserve">Explicit statement that the 40-protocol governance concentration dataset, exclusions log (133 protocol-controlled address exclusions across 38 protocols), canonical regression dataset including Token Terminal subsidy ratios and on-chain financial data, Hivemapper / io.net / Aethir holder distributions, veCRV cumulative deposit data underlying the Section 4.5.2 ve-locking analysis, and Theil / Atkinson supplementary metrics are available in the linked replication repository. Replication scripts for each table and figure are provided in Supplementary File S5; the cross-protocol Pearson and Spearman correlations reported across Sections 4.3, 4.4, and 4.6 can be reproduced via the replication scripts using only the linked public-source data.</w:t>
+        <w:t xml:space="preserve">Explicit statement that the 40-protocol governance concentration dataset, exclusions log (133 protocol-controlled address exclusions across 38 protocols), canonical regression dataset including Token Terminal subsidy ratios and on-chain financial data, Hivemapper / io.net / Aethir holder distributions, veCRV cumulative deposit data underlying the Section 4.5.2 ve-locking analysis, and Theil / Atkinson supplementary metrics (Supplementary File S9) are available in the linked replication repository. Replication scripts for each table and figure are provided in Supplementary File S5; the cross-protocol Pearson and Spearman correlations reported across Sections 4.3, 4.4, and 4.6 can be reproduced via the replication scripts using only the linked public-source data.</w:t>
+      </w:r>
+    </w:p>
+    <w:p>
+      <w:pPr>
+        <w:pStyle w:val="BodyText"/>
+      </w:pPr>
+      <w:r>
+        <w:rPr>
+          <w:b/>
+          <w:bCs/>
+        </w:rPr>
+        <w:t xml:space="preserve">Insider-classification provenance and the strengthened headline (final-version cycle; Sections 3.4, 4.4, 4.6.4).</w:t>
+      </w:r>
+      <w:r>
+        <w:t xml:space="preserve"> </w:t>
+      </w:r>
+      <w:r>
+        <w:t xml:space="preserve">The post-R2 final-version cycle re-derived the insider layer from primary on-chain evidence and re-ran the full statistical battery against it. The result is reassuring in both directions: the sector headline reproduces and strengthens, and the insider layer that supports it is now source-cited and auditable rather than keyword-coded. First, the headline reproduces from a one-command replication and is robust across six independent insider-classification schemes. The replication package regenerates the powered specification deterministically (one command; no live-API dependency; nine of nine new-cohort holder HHIs reproduce from raw inputs), and the DePIN sector finding holds under every one of six independent insider-classification schemes spanning a keyword-floor lower bound through reliability-gated and adversarially reviewed variants to the evidence-traced classification of record. The DePIN sector coefficient stays positive and significant under all six, with its two-sided p-value ranging from 0.0058 at the keyword floor to 0.0187 at the most permissive gap-filled variant (0.0139 under the evidence-traced classification of record); all six fall below 0.02. The insider-retention regressor itself is not significant under any scheme, so the sector channel, not the insider-retention channel, carries the result regardless of how insider holdings are coded (Section 4.6.4). Second, the insider layer is now evidence-traced rather than keyword-coded, and the trace surfaced and corrected a systematic over-count. The classification of record combines third-party on-chain entity labels (Nansen Address Labels), Blockscout verified-contract labels and Dune exchange tags, vesting-contract bytecode matching, and, for multi-signature treasuries, deployer-and-signer tracing (Section 3.4). The governing rule for multi-signature wallets is team-confirmation: a Safe counts as insider only when its deployer or signing set resolves to the protocol team, founder, or a named investor, rather than treating any multisig as insider by default. This rule corrects an over-count present in keyword-only coding, in which independent large holders’ Safes were attributed to the team: of seventeen high-share bare Safes traced across the cross-section, six resolve to protocol teams and eleven to independent holders, with three deployer traces documented as worked exemplars in the replication package. Because the evidence-traced classification corrects this over-count, the sector signal is, if anything, sharpest under the classification of record (0.0139). The full per-survivor classification spine, the per-scheme robustness table, the seventeen-Safe deployer-and-signer verdicts (six team-confirmed, eleven independent), and the staking-attribution audit (the AAVE and ENA insider-share recovery and the Livepeer orchestrator-level bloc-voting HHI) are documented in Supplementary File S22; the Class 3 versus Class 5 transaction-pattern disambiguation methodology applied in the lower-attribution-coverage cases is in Supplementary File S21.</w:t>
+      </w:r>
+    </w:p>
+    <w:p>
+      <w:pPr>
+        <w:pStyle w:val="BodyText"/>
+      </w:pPr>
+      <w:r>
+        <w:rPr>
+          <w:b/>
+          <w:bCs/>
+        </w:rPr>
+        <w:t xml:space="preserve">Multivariate sector coefficient now significant under both the raw and the log measures (Sections 4.4, 4.6.4).</w:t>
+      </w:r>
+      <w:r>
+        <w:t xml:space="preserve"> </w:t>
+      </w:r>
+      <w:r>
+        <w:t xml:space="preserve">The powered specification (Model 4; covariate-complete sample, N = 50; HC3 robust standard errors) regresses governance HHI on sector, revenue intensity, and protocol maturity at twelve and a half observations per predictor. Under the log-HHI measure the DePIN coefficient is positive and significant (p = 0.0197) and does not attenuate when revenue intensity and maturity are added (both controls individually uninformative, p = 0.97 and p = 0.96). The strengthening point is that the result no longer depends on the log transform: in untransformed HHI the DePIN coefficient is the same sign and also significant (coefficient +0.035, p = 0.030), so the powered specification holds under both the raw and the skew-correcting log measures. The same-direction contrast on the full unbalanced sample is shown in the sector boxplot (Figure 2) and computed as a robustness companion in the replication package (full-frame Mann-Whitney p = 0.0234, Cohen’s d = 0.939); it is distinct from the balanced thirty-protocol sector headline reported in the main text, which is unchanged (Mann-Whitney p = 0.020, Cohen’s d = 0.94).</w:t>
+      </w:r>
+    </w:p>
+    <w:p>
+      <w:pPr>
+        <w:pStyle w:val="BodyText"/>
+      </w:pPr>
+      <w:r>
+        <w:rPr>
+          <w:b/>
+          <w:bCs/>
+        </w:rPr>
+        <w:t xml:space="preserve">Staking-attribution recovers a hidden insider share that the holder snapshot does not register (Section 4.4; the staking-contract exclusion rule is in Section 3.8).</w:t>
+      </w:r>
+      <w:r>
+        <w:t xml:space="preserve"> </w:t>
+      </w:r>
+      <w:r>
+        <w:t xml:space="preserve">Address-level attribution of staked balances back to their underlying stakers makes explicit what the wholesale staking-contract exclusion hides. The stkAAVE staking contract holds 21.67 percent of AAVE supply, of which roughly 4.4 to 6.3 percent of total supply is insider AAVE (team multi-signature wallets plus the founder) invisible to the top-1000 holder snapshot. The methodologically important point is the direction of the holding-HHI effect: attributing the staked balance back leaves the address-level holding HHI essentially unchanged, and if anything marginally lower, because the recovered insider stake re-enters as several distinct staker addresses rather than as a single block, enlarging the post-exclusion holder denominator more than it concentrates the squared-share sum. The substantive result is therefore the recovered insider share, not a movement in the holding HHI. This extends the paper’s argument that the holding measure understates effective control: the concentration the holding HHI does not register surfaces instead in the insider share and in delegated voting power.</w:t>
+      </w:r>
+    </w:p>
+    <w:p>
+      <w:pPr>
+        <w:pStyle w:val="BodyText"/>
+      </w:pPr>
+      <w:r>
+        <w:rPr>
+          <w:b/>
+          <w:bCs/>
+        </w:rPr>
+        <w:t xml:space="preserve">Livepeer joins the dispersion exceptions as the most pronounced DePIN governance disperser, with the holding-concentration headline untouched (Section 4.5).</w:t>
+      </w:r>
+      <w:r>
+        <w:t xml:space="preserve"> </w:t>
+      </w:r>
+      <w:r>
+        <w:t xml:space="preserve">Orchestrator-level governance for Livepeer is computed over active orchestrators by total bonded stake (self plus delegated) from the Livepeer protocol subgraph, the apples-to-apples governance-power surface for a bonded-stake-delegation design. The orchestrator bloc-voting HHI is 0.0535 across 100 active orchestrators (as-of Arbitrum block 468186375 / round 4216), 3.7 times lower than Livepeer’s raw holding HHI of 0.198868 (ratio 0.27x). Livepeer is therefore the most pronounced DePIN governance disperser, at a 0.27x ratio below Helium’s 0.35x to 0.53x range, joining ENS, GMX, Helium, and Jupiter as a structural dispersion exception. This governance-layer dispersion sits on a different axis from the Livepeer subsidy-outlier finding (Section 4.4) and does not disturb the sector headline: Livepeer’s holding concentration remains the cross-section maximum (0.199, Table 3), so the DePIN-concentration finding is unaffected by the orchestrator-level voting result. The finding inverts the prior expectation that bonded-stake delegation would concentrate Livepeer governance and is reported as a documented direction-of-effect result rather than a revision to the holding cross-section.</w:t>
       </w:r>
     </w:p>
     <w:p>

</xml_diff>